<commit_message>
Eliminar seccion Boletin informativo del footer
- index.html: se quita la seccion boletin-heading (formulario de suscripcion)
  del footer. El footer queda con nav institucional, redes sociales y
  address/contacto.
- Figma: eliminado el frame footer-newsletter; el footer (auto-layout
  horizontal, space-between) reflow automaticamente a 3 columnas.
- wireframe-home-staybooker360.png regenerado.
- Taller1-Parte1-StayBooker360.docx: bullet de arquitectura de Footer sin
  mencion a boletin, bullet de <form> sin referencia al boletin (footer),
  capturas de navegador y codigo fuente embebido actualizados.
</commit_message>
<xml_diff>
--- a/taller-1/parte-1/Taller1-Parte1-StayBooker360.docx
+++ b/taller-1/parte-1/Taller1-Parte1-StayBooker360.docx
@@ -755,7 +755,7 @@
           <w:rFonts w:eastAsia="Arial" w:cs="Arial"/>
           <w:szCs w:val="24"/>
         </w:rPr>
-        <w:t>Footer: enlaces institucionales, redes sociales, boletín informativo y contacto.</w:t>
+        <w:t>Footer: enlaces institucionales, redes sociales y contacto.</w:t>
       </w:r>
     </w:p>
     <w:p>
@@ -1096,7 +1096,7 @@
           <w:sz w:val="24"/>
           <w:szCs w:val="24"/>
         </w:rPr>
-        <w:t>&lt;form&gt;, &lt;fieldset&gt;, &lt;legend&gt;, &lt;label&gt;, &lt;input&gt;, &lt;button&gt;: estructura del buscador de alojamiento (hero) y del boletín (footer), sin validaciones ni estilos.</w:t>
+        <w:t>&lt;form&gt;, &lt;fieldset&gt;, &lt;legend&gt;, &lt;label&gt;, &lt;input&gt;, &lt;button&gt;: estructura del buscador de alojamiento (hero), sin validaciones ni estilos.</w:t>
       </w:r>
     </w:p>
     <w:p>
@@ -5899,205 +5899,6 @@
           <w:szCs w:val="16"/>
         </w:rPr>
         <w:t>&lt;/ul&gt;</w:t>
-      </w:r>
-    </w:p>
-    <w:p>
-      <w:pPr>
-        <w:pStyle w:val="Normal"/>
-        <w:spacing w:lineRule="auto" w:line="240" w:before="0" w:after="0"/>
-        <w:rPr/>
-      </w:pPr>
-      <w:r>
-        <w:rPr>
-          <w:rFonts w:eastAsia="Courier New" w:cs="Courier New" w:ascii="Courier New" w:hAnsi="Courier New"/>
-          <w:sz w:val="16"/>
-          <w:szCs w:val="16"/>
-        </w:rPr>
-        <w:t xml:space="preserve">  </w:t>
-      </w:r>
-      <w:r>
-        <w:rPr>
-          <w:rFonts w:eastAsia="Courier New" w:cs="Courier New" w:ascii="Courier New" w:hAnsi="Courier New"/>
-          <w:sz w:val="16"/>
-          <w:szCs w:val="16"/>
-        </w:rPr>
-        <w:t>&lt;/section&gt;</w:t>
-      </w:r>
-    </w:p>
-    <w:p>
-      <w:pPr>
-        <w:pStyle w:val="Normal"/>
-        <w:spacing w:lineRule="auto" w:line="240" w:before="0" w:after="0"/>
-        <w:rPr/>
-      </w:pPr>
-      <w:r>
-        <w:rPr>
-          <w:rFonts w:eastAsia="Courier New" w:cs="Courier New" w:ascii="Courier New" w:hAnsi="Courier New"/>
-          <w:sz w:val="16"/>
-          <w:szCs w:val="16"/>
-        </w:rPr>
-        <w:t xml:space="preserve"> </w:t>
-      </w:r>
-    </w:p>
-    <w:p>
-      <w:pPr>
-        <w:pStyle w:val="Normal"/>
-        <w:spacing w:lineRule="auto" w:line="240" w:before="0" w:after="0"/>
-        <w:rPr/>
-      </w:pPr>
-      <w:r>
-        <w:rPr>
-          <w:rFonts w:eastAsia="Courier New" w:cs="Courier New" w:ascii="Courier New" w:hAnsi="Courier New"/>
-          <w:sz w:val="16"/>
-          <w:szCs w:val="16"/>
-        </w:rPr>
-        <w:t xml:space="preserve">  </w:t>
-      </w:r>
-      <w:r>
-        <w:rPr>
-          <w:rFonts w:eastAsia="Courier New" w:cs="Courier New" w:ascii="Courier New" w:hAnsi="Courier New"/>
-          <w:sz w:val="16"/>
-          <w:szCs w:val="16"/>
-        </w:rPr>
-        <w:t>&lt;section aria-labelledby="boletin-heading"&gt;</w:t>
-      </w:r>
-    </w:p>
-    <w:p>
-      <w:pPr>
-        <w:pStyle w:val="Normal"/>
-        <w:spacing w:lineRule="auto" w:line="240" w:before="0" w:after="0"/>
-        <w:rPr/>
-      </w:pPr>
-      <w:r>
-        <w:rPr>
-          <w:rFonts w:eastAsia="Courier New" w:cs="Courier New" w:ascii="Courier New" w:hAnsi="Courier New"/>
-          <w:sz w:val="16"/>
-          <w:szCs w:val="16"/>
-        </w:rPr>
-        <w:t xml:space="preserve">    </w:t>
-      </w:r>
-      <w:r>
-        <w:rPr>
-          <w:rFonts w:eastAsia="Courier New" w:cs="Courier New" w:ascii="Courier New" w:hAnsi="Courier New"/>
-          <w:sz w:val="16"/>
-          <w:szCs w:val="16"/>
-        </w:rPr>
-        <w:t>&lt;h2 id="boletin-heading"&gt;Boletín informativo&lt;/h2&gt;</w:t>
-      </w:r>
-    </w:p>
-    <w:p>
-      <w:pPr>
-        <w:pStyle w:val="Normal"/>
-        <w:spacing w:lineRule="auto" w:line="240" w:before="0" w:after="0"/>
-        <w:rPr/>
-      </w:pPr>
-      <w:r>
-        <w:rPr>
-          <w:rFonts w:eastAsia="Courier New" w:cs="Courier New" w:ascii="Courier New" w:hAnsi="Courier New"/>
-          <w:sz w:val="16"/>
-          <w:szCs w:val="16"/>
-        </w:rPr>
-        <w:t xml:space="preserve">    </w:t>
-      </w:r>
-      <w:r>
-        <w:rPr>
-          <w:rFonts w:eastAsia="Courier New" w:cs="Courier New" w:ascii="Courier New" w:hAnsi="Courier New"/>
-          <w:sz w:val="16"/>
-          <w:szCs w:val="16"/>
-        </w:rPr>
-        <w:t>&lt;form action="suscripcion.html" method="post"&gt;</w:t>
-      </w:r>
-    </w:p>
-    <w:p>
-      <w:pPr>
-        <w:pStyle w:val="Normal"/>
-        <w:spacing w:lineRule="auto" w:line="240" w:before="0" w:after="0"/>
-        <w:rPr/>
-      </w:pPr>
-      <w:r>
-        <w:rPr>
-          <w:rFonts w:eastAsia="Courier New" w:cs="Courier New" w:ascii="Courier New" w:hAnsi="Courier New"/>
-          <w:sz w:val="16"/>
-          <w:szCs w:val="16"/>
-        </w:rPr>
-        <w:t xml:space="preserve">      </w:t>
-      </w:r>
-      <w:r>
-        <w:rPr>
-          <w:rFonts w:eastAsia="Courier New" w:cs="Courier New" w:ascii="Courier New" w:hAnsi="Courier New"/>
-          <w:sz w:val="16"/>
-          <w:szCs w:val="16"/>
-        </w:rPr>
-        <w:t>&lt;label for="correo-boletin"&gt;Correo electrónico&lt;/label&gt;</w:t>
-      </w:r>
-    </w:p>
-    <w:p>
-      <w:pPr>
-        <w:pStyle w:val="Normal"/>
-        <w:spacing w:lineRule="auto" w:line="240" w:before="0" w:after="0"/>
-        <w:rPr/>
-      </w:pPr>
-      <w:r>
-        <w:rPr>
-          <w:rFonts w:eastAsia="Courier New" w:cs="Courier New" w:ascii="Courier New" w:hAnsi="Courier New"/>
-          <w:sz w:val="16"/>
-          <w:szCs w:val="16"/>
-        </w:rPr>
-        <w:t xml:space="preserve">      </w:t>
-      </w:r>
-      <w:r>
-        <w:rPr>
-          <w:rFonts w:eastAsia="Courier New" w:cs="Courier New" w:ascii="Courier New" w:hAnsi="Courier New"/>
-          <w:sz w:val="16"/>
-          <w:szCs w:val="16"/>
-        </w:rPr>
-        <w:t>&lt;input type="email" id="correo-boletin" name="correo"&gt;</w:t>
-      </w:r>
-    </w:p>
-    <w:p>
-      <w:pPr>
-        <w:pStyle w:val="Normal"/>
-        <w:spacing w:lineRule="auto" w:line="240" w:before="0" w:after="0"/>
-        <w:rPr/>
-      </w:pPr>
-      <w:r>
-        <w:rPr>
-          <w:rFonts w:eastAsia="Courier New" w:cs="Courier New" w:ascii="Courier New" w:hAnsi="Courier New"/>
-          <w:sz w:val="16"/>
-          <w:szCs w:val="16"/>
-        </w:rPr>
-        <w:t xml:space="preserve">      </w:t>
-      </w:r>
-      <w:r>
-        <w:rPr>
-          <w:rFonts w:eastAsia="Courier New" w:cs="Courier New" w:ascii="Courier New" w:hAnsi="Courier New"/>
-          <w:sz w:val="16"/>
-          <w:szCs w:val="16"/>
-        </w:rPr>
-        <w:t>&lt;button type="submit"&gt;Suscribirse&lt;/button&gt;</w:t>
-      </w:r>
-    </w:p>
-    <w:p>
-      <w:pPr>
-        <w:pStyle w:val="Normal"/>
-        <w:spacing w:lineRule="auto" w:line="240" w:before="0" w:after="0"/>
-        <w:rPr/>
-      </w:pPr>
-      <w:r>
-        <w:rPr>
-          <w:rFonts w:eastAsia="Courier New" w:cs="Courier New" w:ascii="Courier New" w:hAnsi="Courier New"/>
-          <w:sz w:val="16"/>
-          <w:szCs w:val="16"/>
-        </w:rPr>
-        <w:t xml:space="preserve">    </w:t>
-      </w:r>
-      <w:r>
-        <w:rPr>
-          <w:rFonts w:eastAsia="Courier New" w:cs="Courier New" w:ascii="Courier New" w:hAnsi="Courier New"/>
-          <w:sz w:val="16"/>
-          <w:szCs w:val="16"/>
-        </w:rPr>
-        <w:t>&lt;/form&gt;</w:t>
       </w:r>
     </w:p>
     <w:p>

</xml_diff>

<commit_message>
Renombrar grupo de footer a Compania y acortar X (Twitter) a X
- index.html: nav aria-label de 'Enlaces institucionales' a 'Enlaces de la
  compania'; enlace social de 'X (Twitter)' a 'X'.
- Figma: texto 'Institucional' a 'Compania' y 'X (Twitter)' a 'X' en el footer.
- wireframe-home-staybooker360.png regenerado.
- Taller1-Parte1-StayBooker360.docx: bullets de arquitectura y de etiquetas
  <nav> actualizados ('enlaces de la compania'), seccion 5 ('Navegacion de la
  compania'), capturas de navegador y codigo fuente embebido regenerados.
</commit_message>
<xml_diff>
--- a/taller-1/parte-1/Taller1-Parte1-StayBooker360.docx
+++ b/taller-1/parte-1/Taller1-Parte1-StayBooker360.docx
@@ -755,7 +755,7 @@
           <w:rFonts w:eastAsia="Arial" w:cs="Arial"/>
           <w:szCs w:val="24"/>
         </w:rPr>
-        <w:t>Footer: enlaces institucionales, redes sociales y contacto.</w:t>
+        <w:t>Footer: enlaces de la compañía, redes sociales y contacto.</w:t>
       </w:r>
     </w:p>
     <w:p>
@@ -958,7 +958,7 @@
           <w:sz w:val="24"/>
           <w:szCs w:val="24"/>
         </w:rPr>
-        <w:t>&lt;nav&gt;: agrupa los enlaces de navegación. En el header, un único &lt;nav&gt; reúne tres listas (cuenta, recursos, idioma/moneda) para evitar exceso de landmarks de accesibilidad; en el footer, un &lt;nav&gt; aparte agrupa los enlaces institucionales.</w:t>
+        <w:t>&lt;nav&gt;: agrupa los enlaces de navegación. En el header, un único &lt;nav&gt; reúne tres listas (cuenta, recursos, idioma/moneda) para evitar exceso de landmarks de accesibilidad; en el footer, un &lt;nav&gt; aparte agrupa los enlaces de la compañía.</w:t>
       </w:r>
     </w:p>
     <w:p>
@@ -1276,7 +1276,7 @@
           <w:sz w:val="24"/>
           <w:szCs w:val="24"/>
         </w:rPr>
-        <w:t>Navegación institucional (footer): Políticas de privacidad, Términos de uso, Ayuda y preguntas frecuentes, Sobre nosotros.</w:t>
+        <w:t>Navegación de la compañía (footer): Políticas de privacidad, Términos de uso, Ayuda y preguntas frecuentes, Sobre nosotros.</w:t>
       </w:r>
     </w:p>
     <w:p>
@@ -5538,7 +5538,7 @@
           <w:sz w:val="16"/>
           <w:szCs w:val="16"/>
         </w:rPr>
-        <w:t>&lt;nav aria-label="Enlaces institucionales"&gt;</w:t>
+        <w:t>&lt;nav aria-label="Enlaces de la compañía"&gt;</w:t>
       </w:r>
     </w:p>
     <w:p>
@@ -5852,7 +5852,7 @@
           <w:sz w:val="16"/>
           <w:szCs w:val="16"/>
         </w:rPr>
-        <w:t>&lt;li&gt;&lt;a href="https://x.com/staybooker360"&gt;X (Twitter)&lt;/a&gt;&lt;/li&gt;</w:t>
+        <w:t>&lt;li&gt;&lt;a href="https://x.com/staybooker360"&gt;X&lt;/a&gt;&lt;/li&gt;</w:t>
       </w:r>
     </w:p>
     <w:p>

</xml_diff>

<commit_message>
Agregar h2 visible Compania al nav del footer
index.html: el nav de enlaces de la compania pasa de aria-label a
aria-labelledby con un h2 id=compania-heading visible, igualando el
patron ya usado en Redes sociales. Taller1-Parte1-StayBooker360.docx:
capturas de navegador y codigo fuente embebido regenerados.
</commit_message>
<xml_diff>
--- a/taller-1/parte-1/Taller1-Parte1-StayBooker360.docx
+++ b/taller-1/parte-1/Taller1-Parte1-StayBooker360.docx
@@ -5538,7 +5538,30 @@
           <w:sz w:val="16"/>
           <w:szCs w:val="16"/>
         </w:rPr>
-        <w:t>&lt;nav aria-label="Enlaces de la compañía"&gt;</w:t>
+        <w:t>&lt;nav aria-labelledby="compania-heading"&gt;</w:t>
+      </w:r>
+    </w:p>
+    <w:p>
+      <w:pPr>
+        <w:pStyle w:val="Normal"/>
+        <w:spacing w:lineRule="auto" w:line="240" w:before="0" w:after="0"/>
+        <w:rPr/>
+      </w:pPr>
+      <w:r>
+        <w:rPr>
+          <w:rFonts w:eastAsia="Courier New" w:cs="Courier New" w:ascii="Courier New" w:hAnsi="Courier New"/>
+          <w:sz w:val="16"/>
+          <w:szCs w:val="16"/>
+        </w:rPr>
+        <w:t xml:space="preserve">    </w:t>
+      </w:r>
+      <w:r>
+        <w:rPr>
+          <w:rFonts w:eastAsia="Courier New" w:cs="Courier New" w:ascii="Courier New" w:hAnsi="Courier New"/>
+          <w:sz w:val="16"/>
+          <w:szCs w:val="16"/>
+        </w:rPr>
+        <w:t>&lt;h2 id="compania-heading"&gt;Compañía&lt;/h2&gt;</w:t>
       </w:r>
     </w:p>
     <w:p>

</xml_diff>

<commit_message>
Restaurar seccion Boletin informativo en el footer
- index.html: se re-agrega la seccion boletin-heading (formulario de
  suscripcion) entre Redes sociales y address, ya que el enunciado del
  taller la menciona.
- Figma: recreado el frame footer-newsletter y reinsertado entre
  footer-social y footer-contacto; el footer (auto-layout horizontal,
  space-between) vuelve a distribuir 4 columnas.
- wireframe-home-staybooker360.png regenerado.
- Taller1-Parte1-StayBooker360.docx: editado directamente sobre la version
  que el usuario guardo manualmente en Word (bullets de arquitectura y de
  <form>, imagen de wireframe, codigo fuente embebido), sin tocar sus
  otras ediciones manuales (portada, seccion 5 simplificada, captura de
  navegador propia en 6.1).
</commit_message>
<xml_diff>
--- a/taller-1/parte-1/Taller1-Parte1-StayBooker360.docx
+++ b/taller-1/parte-1/Taller1-Parte1-StayBooker360.docx
@@ -763,7 +763,7 @@
           <w:rFonts w:eastAsia="Arial" w:cs="Arial"/>
           <w:szCs w:val="24"/>
         </w:rPr>
-        <w:t>Footer: enlaces de la compañía, redes sociales y contacto.</w:t>
+        <w:t>Footer: enlaces de la compañía, redes sociales, boletín informativo y contacto.</w:t>
       </w:r>
     </w:p>
     <w:p>
@@ -1126,7 +1126,7 @@
           <w:sz w:val="24"/>
           <w:szCs w:val="24"/>
         </w:rPr>
-        <w:t>&lt;form&gt;, &lt;fieldset&gt;, &lt;legend&gt;, &lt;label&gt;, &lt;input&gt;, &lt;button&gt;: estructura del buscador de alojamiento (hero), sin validaciones ni estilos.</w:t>
+        <w:t>&lt;form&gt;, &lt;fieldset&gt;, &lt;legend&gt;, &lt;label&gt;, &lt;input&gt;, &lt;button&gt;: estructura del buscador de alojamiento (hero) y del boletín (footer), sin validaciones ni estilos.</w:t>
       </w:r>
     </w:p>
     <w:p>
@@ -5539,6 +5539,205 @@
           <w:szCs w:val="16"/>
         </w:rPr>
         <w:t>&lt;/ul&gt;</w:t>
+      </w:r>
+    </w:p>
+    <w:p>
+      <w:pPr>
+        <w:pStyle w:val="Normal"/>
+        <w:spacing w:lineRule="auto" w:line="240" w:before="0" w:after="0"/>
+        <w:rPr/>
+      </w:pPr>
+      <w:r>
+        <w:rPr>
+          <w:rFonts w:eastAsia="Courier New" w:cs="Courier New" w:ascii="Courier New" w:hAnsi="Courier New"/>
+          <w:sz w:val="16"/>
+          <w:szCs w:val="16"/>
+        </w:rPr>
+        <w:t xml:space="preserve">  </w:t>
+      </w:r>
+      <w:r>
+        <w:rPr>
+          <w:rFonts w:eastAsia="Courier New" w:cs="Courier New" w:ascii="Courier New" w:hAnsi="Courier New"/>
+          <w:sz w:val="16"/>
+          <w:szCs w:val="16"/>
+        </w:rPr>
+        <w:t>&lt;/section&gt;</w:t>
+      </w:r>
+    </w:p>
+    <w:p>
+      <w:pPr>
+        <w:pStyle w:val="Normal"/>
+        <w:spacing w:lineRule="auto" w:line="240" w:before="0" w:after="0"/>
+        <w:rPr/>
+      </w:pPr>
+      <w:r>
+        <w:rPr>
+          <w:rFonts w:eastAsia="Courier New" w:cs="Courier New" w:ascii="Courier New" w:hAnsi="Courier New"/>
+          <w:sz w:val="16"/>
+          <w:szCs w:val="16"/>
+        </w:rPr>
+        <w:t xml:space="preserve"> </w:t>
+      </w:r>
+    </w:p>
+    <w:p>
+      <w:pPr>
+        <w:pStyle w:val="Normal"/>
+        <w:spacing w:lineRule="auto" w:line="240" w:before="0" w:after="0"/>
+        <w:rPr/>
+      </w:pPr>
+      <w:r>
+        <w:rPr>
+          <w:rFonts w:eastAsia="Courier New" w:cs="Courier New" w:ascii="Courier New" w:hAnsi="Courier New"/>
+          <w:sz w:val="16"/>
+          <w:szCs w:val="16"/>
+        </w:rPr>
+        <w:t xml:space="preserve">  </w:t>
+      </w:r>
+      <w:r>
+        <w:rPr>
+          <w:rFonts w:eastAsia="Courier New" w:cs="Courier New" w:ascii="Courier New" w:hAnsi="Courier New"/>
+          <w:sz w:val="16"/>
+          <w:szCs w:val="16"/>
+        </w:rPr>
+        <w:t>&lt;section aria-labelledby="boletin-heading"&gt;</w:t>
+      </w:r>
+    </w:p>
+    <w:p>
+      <w:pPr>
+        <w:pStyle w:val="Normal"/>
+        <w:spacing w:lineRule="auto" w:line="240" w:before="0" w:after="0"/>
+        <w:rPr/>
+      </w:pPr>
+      <w:r>
+        <w:rPr>
+          <w:rFonts w:eastAsia="Courier New" w:cs="Courier New" w:ascii="Courier New" w:hAnsi="Courier New"/>
+          <w:sz w:val="16"/>
+          <w:szCs w:val="16"/>
+        </w:rPr>
+        <w:t xml:space="preserve">    </w:t>
+      </w:r>
+      <w:r>
+        <w:rPr>
+          <w:rFonts w:eastAsia="Courier New" w:cs="Courier New" w:ascii="Courier New" w:hAnsi="Courier New"/>
+          <w:sz w:val="16"/>
+          <w:szCs w:val="16"/>
+        </w:rPr>
+        <w:t>&lt;h2 id="boletin-heading"&gt;Boletín informativo&lt;/h2&gt;</w:t>
+      </w:r>
+    </w:p>
+    <w:p>
+      <w:pPr>
+        <w:pStyle w:val="Normal"/>
+        <w:spacing w:lineRule="auto" w:line="240" w:before="0" w:after="0"/>
+        <w:rPr/>
+      </w:pPr>
+      <w:r>
+        <w:rPr>
+          <w:rFonts w:eastAsia="Courier New" w:cs="Courier New" w:ascii="Courier New" w:hAnsi="Courier New"/>
+          <w:sz w:val="16"/>
+          <w:szCs w:val="16"/>
+        </w:rPr>
+        <w:t xml:space="preserve">    </w:t>
+      </w:r>
+      <w:r>
+        <w:rPr>
+          <w:rFonts w:eastAsia="Courier New" w:cs="Courier New" w:ascii="Courier New" w:hAnsi="Courier New"/>
+          <w:sz w:val="16"/>
+          <w:szCs w:val="16"/>
+        </w:rPr>
+        <w:t>&lt;form action="suscripcion.html" method="post"&gt;</w:t>
+      </w:r>
+    </w:p>
+    <w:p>
+      <w:pPr>
+        <w:pStyle w:val="Normal"/>
+        <w:spacing w:lineRule="auto" w:line="240" w:before="0" w:after="0"/>
+        <w:rPr/>
+      </w:pPr>
+      <w:r>
+        <w:rPr>
+          <w:rFonts w:eastAsia="Courier New" w:cs="Courier New" w:ascii="Courier New" w:hAnsi="Courier New"/>
+          <w:sz w:val="16"/>
+          <w:szCs w:val="16"/>
+        </w:rPr>
+        <w:t xml:space="preserve">      </w:t>
+      </w:r>
+      <w:r>
+        <w:rPr>
+          <w:rFonts w:eastAsia="Courier New" w:cs="Courier New" w:ascii="Courier New" w:hAnsi="Courier New"/>
+          <w:sz w:val="16"/>
+          <w:szCs w:val="16"/>
+        </w:rPr>
+        <w:t>&lt;label for="correo-boletin"&gt;Correo electrónico&lt;/label&gt;</w:t>
+      </w:r>
+    </w:p>
+    <w:p>
+      <w:pPr>
+        <w:pStyle w:val="Normal"/>
+        <w:spacing w:lineRule="auto" w:line="240" w:before="0" w:after="0"/>
+        <w:rPr/>
+      </w:pPr>
+      <w:r>
+        <w:rPr>
+          <w:rFonts w:eastAsia="Courier New" w:cs="Courier New" w:ascii="Courier New" w:hAnsi="Courier New"/>
+          <w:sz w:val="16"/>
+          <w:szCs w:val="16"/>
+        </w:rPr>
+        <w:t xml:space="preserve">      </w:t>
+      </w:r>
+      <w:r>
+        <w:rPr>
+          <w:rFonts w:eastAsia="Courier New" w:cs="Courier New" w:ascii="Courier New" w:hAnsi="Courier New"/>
+          <w:sz w:val="16"/>
+          <w:szCs w:val="16"/>
+        </w:rPr>
+        <w:t>&lt;input type="email" id="correo-boletin" name="correo"&gt;</w:t>
+      </w:r>
+    </w:p>
+    <w:p>
+      <w:pPr>
+        <w:pStyle w:val="Normal"/>
+        <w:spacing w:lineRule="auto" w:line="240" w:before="0" w:after="0"/>
+        <w:rPr/>
+      </w:pPr>
+      <w:r>
+        <w:rPr>
+          <w:rFonts w:eastAsia="Courier New" w:cs="Courier New" w:ascii="Courier New" w:hAnsi="Courier New"/>
+          <w:sz w:val="16"/>
+          <w:szCs w:val="16"/>
+        </w:rPr>
+        <w:t xml:space="preserve">      </w:t>
+      </w:r>
+      <w:r>
+        <w:rPr>
+          <w:rFonts w:eastAsia="Courier New" w:cs="Courier New" w:ascii="Courier New" w:hAnsi="Courier New"/>
+          <w:sz w:val="16"/>
+          <w:szCs w:val="16"/>
+        </w:rPr>
+        <w:t>&lt;button type="submit"&gt;Suscribirse&lt;/button&gt;</w:t>
+      </w:r>
+    </w:p>
+    <w:p>
+      <w:pPr>
+        <w:pStyle w:val="Normal"/>
+        <w:spacing w:lineRule="auto" w:line="240" w:before="0" w:after="0"/>
+        <w:rPr/>
+      </w:pPr>
+      <w:r>
+        <w:rPr>
+          <w:rFonts w:eastAsia="Courier New" w:cs="Courier New" w:ascii="Courier New" w:hAnsi="Courier New"/>
+          <w:sz w:val="16"/>
+          <w:szCs w:val="16"/>
+        </w:rPr>
+        <w:t xml:space="preserve">    </w:t>
+      </w:r>
+      <w:r>
+        <w:rPr>
+          <w:rFonts w:eastAsia="Courier New" w:cs="Courier New" w:ascii="Courier New" w:hAnsi="Courier New"/>
+          <w:sz w:val="16"/>
+          <w:szCs w:val="16"/>
+        </w:rPr>
+        <w:t>&lt;/form&gt;</w:t>
       </w:r>
     </w:p>
     <w:p>

</xml_diff>

<commit_message>
Sincronizar Figma, wireframe y codigo embebido con la ultima edicion manual de index.html
El usuario edito parte-1/index.html directamente: agrego enlaces 'Inicio' y
'Promociones' al grupo de recursos del header, marco paginas actuales con
aria-current, y ajusto varios hrefs (mis-reservas.html, index.html?lang=en/fr,
catalogo.html como destino del buscador), en linea con la navegacion 'Inicio'
que ya se agrego a las paginas de Parte 2.

- Figma: nav-recursos ahora incluye Inicio/Explorar/Promociones/Blog/Ayuda
  en el orden correcto; el header (auto-layout) reflowo automaticamente.
- wireframe-home-staybooker360.png regenerado.
- Taller1-Parte1-StayBooker360.docx: imagen del wireframe y codigo fuente
  embebido (seccion 6.2) actualizados; el resto del documento no se toco.
</commit_message>
<xml_diff>
--- a/taller-1/parte-1/Taller1-Parte1-StayBooker360.docx
+++ b/taller-1/parte-1/Taller1-Parte1-StayBooker360.docx
@@ -1822,7 +1822,7 @@
           <w:sz w:val="16"/>
           <w:szCs w:val="16"/>
         </w:rPr>
-        <w:t>&lt;li&gt;&lt;a href="reservas.html"&gt;Mis reservas&lt;/a&gt;&lt;/li&gt;</w:t>
+        <w:t>&lt;li&gt;&lt;a href="mis-reservas.html"&gt;Mis reservas&lt;/a&gt;&lt;/li&gt;</w:t>
       </w:r>
     </w:p>
     <w:p>
@@ -1906,6 +1906,29 @@
           <w:sz w:val="16"/>
           <w:szCs w:val="16"/>
         </w:rPr>
+        <w:t>&lt;li&gt;&lt;a href="index.html" aria-current="page"&gt;Inicio&lt;/a&gt;&lt;/li&gt;</w:t>
+      </w:r>
+    </w:p>
+    <w:p>
+      <w:pPr>
+        <w:pStyle w:val="Normal"/>
+        <w:spacing w:lineRule="auto" w:line="240" w:before="0" w:after="0"/>
+        <w:rPr/>
+      </w:pPr>
+      <w:r>
+        <w:rPr>
+          <w:rFonts w:eastAsia="Courier New" w:cs="Courier New" w:ascii="Courier New" w:hAnsi="Courier New"/>
+          <w:sz w:val="16"/>
+          <w:szCs w:val="16"/>
+        </w:rPr>
+        <w:t xml:space="preserve">      </w:t>
+      </w:r>
+      <w:r>
+        <w:rPr>
+          <w:rFonts w:eastAsia="Courier New" w:cs="Courier New" w:ascii="Courier New" w:hAnsi="Courier New"/>
+          <w:sz w:val="16"/>
+          <w:szCs w:val="16"/>
+        </w:rPr>
         <w:t>&lt;li&gt;&lt;a href="catalogo.html"&gt;Explorar&lt;/a&gt;&lt;/li&gt;</w:t>
       </w:r>
     </w:p>
@@ -1929,6 +1952,29 @@
           <w:sz w:val="16"/>
           <w:szCs w:val="16"/>
         </w:rPr>
+        <w:t>&lt;li&gt;&lt;a href="promociones.html"&gt;Promociones&lt;/a&gt;&lt;/li&gt;</w:t>
+      </w:r>
+    </w:p>
+    <w:p>
+      <w:pPr>
+        <w:pStyle w:val="Normal"/>
+        <w:spacing w:lineRule="auto" w:line="240" w:before="0" w:after="0"/>
+        <w:rPr/>
+      </w:pPr>
+      <w:r>
+        <w:rPr>
+          <w:rFonts w:eastAsia="Courier New" w:cs="Courier New" w:ascii="Courier New" w:hAnsi="Courier New"/>
+          <w:sz w:val="16"/>
+          <w:szCs w:val="16"/>
+        </w:rPr>
+        <w:t xml:space="preserve">      </w:t>
+      </w:r>
+      <w:r>
+        <w:rPr>
+          <w:rFonts w:eastAsia="Courier New" w:cs="Courier New" w:ascii="Courier New" w:hAnsi="Courier New"/>
+          <w:sz w:val="16"/>
+          <w:szCs w:val="16"/>
+        </w:rPr>
         <w:t>&lt;li&gt;&lt;a href="blog.html"&gt;Blog&lt;/a&gt;&lt;/li&gt;</w:t>
       </w:r>
     </w:p>
@@ -2036,7 +2082,7 @@
           <w:sz w:val="16"/>
           <w:szCs w:val="16"/>
         </w:rPr>
-        <w:t>&lt;li&gt;&lt;a href="index.html" hreflang="es"&gt;ES&lt;/a&gt;&lt;/li&gt;</w:t>
+        <w:t>&lt;li&gt;&lt;a href="index.html" hreflang="es" aria-current="page"&gt;ES&lt;/a&gt;&lt;/li&gt;</w:t>
       </w:r>
     </w:p>
     <w:p>
@@ -2059,7 +2105,7 @@
           <w:sz w:val="16"/>
           <w:szCs w:val="16"/>
         </w:rPr>
-        <w:t>&lt;li&gt;&lt;a href="index-en.html" hreflang="en"&gt;EN&lt;/a&gt;&lt;/li&gt;</w:t>
+        <w:t>&lt;li&gt;&lt;a href="index.html?lang=en" hreflang="en"&gt;EN&lt;/a&gt;&lt;/li&gt;</w:t>
       </w:r>
     </w:p>
     <w:p>
@@ -2082,7 +2128,7 @@
           <w:sz w:val="16"/>
           <w:szCs w:val="16"/>
         </w:rPr>
-        <w:t>&lt;li&gt;&lt;a href="index-fr.html" hreflang="fr"&gt;FR&lt;/a&gt;&lt;/li&gt;</w:t>
+        <w:t>&lt;li&gt;&lt;a href="index.html?lang=fr" hreflang="fr"&gt;FR&lt;/a&gt;&lt;/li&gt;</w:t>
       </w:r>
     </w:p>
     <w:p>
@@ -2387,7 +2433,7 @@
           <w:sz w:val="16"/>
           <w:szCs w:val="16"/>
         </w:rPr>
-        <w:t>&lt;form action="resultados-busqueda.html" method="get"&gt;</w:t>
+        <w:t>&lt;form action="catalogo.html" method="get"&gt;</w:t>
       </w:r>
     </w:p>
     <w:p>

</xml_diff>

<commit_message>
Cambiar 'Recomendado para ti' de aside/ul a section/article
En index.html: la sección de recomendaciones pasa de <aside><ul><li> a
<section><article> con encabezado h3 por tarjeta, igual que el patron ya
usado en Tipos de alojamiento. El encabezado se acorta a 'Recomendado
para ti'.

En el docx: se actualiza el codigo fuente embebido (6.2) para reflejar
el cambio, y se quita la referencia a '(recomendaciones)' del bullet de
la etiqueta <aside> en la seccion 4, dejando la mencion general de la
etiqueta.
</commit_message>
<xml_diff>
--- a/taller-1/parte-1/Taller1-Parte1-StayBooker360.docx
+++ b/taller-1/parte-1/Taller1-Parte1-StayBooker360.docx
@@ -1080,7 +1080,7 @@
           <w:sz w:val="24"/>
           <w:szCs w:val="24"/>
         </w:rPr>
-        <w:t>&lt;aside&gt;: contenido relacionado pero secundario (recomendaciones).</w:t>
+        <w:t>&lt;aside&gt;: contenido relacionado pero secundario.</w:t>
       </w:r>
     </w:p>
     <w:p>
@@ -4934,7 +4934,7 @@
           <w:sz w:val="16"/>
           <w:szCs w:val="16"/>
         </w:rPr>
-        <w:t>&lt;aside aria-labelledby="recos-heading"&gt;</w:t>
+        <w:t>&lt;section aria-labelledby="recos-heading"&gt;</w:t>
       </w:r>
     </w:p>
     <w:p>
@@ -4957,7 +4957,22 @@
           <w:sz w:val="16"/>
           <w:szCs w:val="16"/>
         </w:rPr>
-        <w:t>&lt;h2 id="recos-heading"&gt;Recomendado para ti según destino y temporada&lt;/h2&gt;</w:t>
+        <w:t>&lt;h2 id="recos-heading"&gt;Recomendado para ti&lt;/h2&gt;</w:t>
+      </w:r>
+    </w:p>
+    <w:p>
+      <w:pPr>
+        <w:pStyle w:val="Normal"/>
+        <w:spacing w:lineRule="auto" w:line="240" w:before="0" w:after="0"/>
+        <w:rPr/>
+      </w:pPr>
+      <w:r>
+        <w:rPr>
+          <w:rFonts w:eastAsia="Courier New" w:cs="Courier New" w:ascii="Courier New" w:hAnsi="Courier New"/>
+          <w:sz w:val="16"/>
+          <w:szCs w:val="16"/>
+        </w:rPr>
+        <w:t xml:space="preserve"> </w:t>
       </w:r>
     </w:p>
     <w:p>
@@ -4980,7 +4995,7 @@
           <w:sz w:val="16"/>
           <w:szCs w:val="16"/>
         </w:rPr>
-        <w:t>&lt;ul&gt;</w:t>
+        <w:t>&lt;article&gt;</w:t>
       </w:r>
     </w:p>
     <w:p>
@@ -5003,7 +5018,68 @@
           <w:sz w:val="16"/>
           <w:szCs w:val="16"/>
         </w:rPr>
-        <w:t>&lt;li&gt;&lt;a href="propiedad-detalle.html?id=5"&gt;Casa de playa — Puntarenas&lt;/a&gt;&lt;/li&gt;</w:t>
+        <w:t>&lt;h3&gt;&lt;a href="propiedad-detalle.html?id=5"&gt;Casa de playa — Puntarenas&lt;/a&gt;&lt;/h3&gt;</w:t>
+      </w:r>
+    </w:p>
+    <w:p>
+      <w:pPr>
+        <w:pStyle w:val="Normal"/>
+        <w:spacing w:lineRule="auto" w:line="240" w:before="0" w:after="0"/>
+        <w:rPr/>
+      </w:pPr>
+      <w:r>
+        <w:rPr>
+          <w:rFonts w:eastAsia="Courier New" w:cs="Courier New" w:ascii="Courier New" w:hAnsi="Courier New"/>
+          <w:sz w:val="16"/>
+          <w:szCs w:val="16"/>
+        </w:rPr>
+        <w:t xml:space="preserve">    </w:t>
+      </w:r>
+      <w:r>
+        <w:rPr>
+          <w:rFonts w:eastAsia="Courier New" w:cs="Courier New" w:ascii="Courier New" w:hAnsi="Courier New"/>
+          <w:sz w:val="16"/>
+          <w:szCs w:val="16"/>
+        </w:rPr>
+        <w:t>&lt;/article&gt;</w:t>
+      </w:r>
+    </w:p>
+    <w:p>
+      <w:pPr>
+        <w:pStyle w:val="Normal"/>
+        <w:spacing w:lineRule="auto" w:line="240" w:before="0" w:after="0"/>
+        <w:rPr/>
+      </w:pPr>
+      <w:r>
+        <w:rPr>
+          <w:rFonts w:eastAsia="Courier New" w:cs="Courier New" w:ascii="Courier New" w:hAnsi="Courier New"/>
+          <w:sz w:val="16"/>
+          <w:szCs w:val="16"/>
+        </w:rPr>
+        <w:t xml:space="preserve"> </w:t>
+      </w:r>
+    </w:p>
+    <w:p>
+      <w:pPr>
+        <w:pStyle w:val="Normal"/>
+        <w:spacing w:lineRule="auto" w:line="240" w:before="0" w:after="0"/>
+        <w:rPr/>
+      </w:pPr>
+      <w:r>
+        <w:rPr>
+          <w:rFonts w:eastAsia="Courier New" w:cs="Courier New" w:ascii="Courier New" w:hAnsi="Courier New"/>
+          <w:sz w:val="16"/>
+          <w:szCs w:val="16"/>
+        </w:rPr>
+        <w:t xml:space="preserve">    </w:t>
+      </w:r>
+      <w:r>
+        <w:rPr>
+          <w:rFonts w:eastAsia="Courier New" w:cs="Courier New" w:ascii="Courier New" w:hAnsi="Courier New"/>
+          <w:sz w:val="16"/>
+          <w:szCs w:val="16"/>
+        </w:rPr>
+        <w:t>&lt;article&gt;</w:t>
       </w:r>
     </w:p>
     <w:p>
@@ -5026,7 +5102,68 @@
           <w:sz w:val="16"/>
           <w:szCs w:val="16"/>
         </w:rPr>
-        <w:t>&lt;li&gt;&lt;a href="propiedad-detalle.html?id=6"&gt;Apartamento — Heredia&lt;/a&gt;&lt;/li&gt;</w:t>
+        <w:t>&lt;h3&gt;&lt;a href="propiedad-detalle.html?id=6"&gt;Apartamento — Heredia&lt;/a&gt;&lt;/h3&gt;</w:t>
+      </w:r>
+    </w:p>
+    <w:p>
+      <w:pPr>
+        <w:pStyle w:val="Normal"/>
+        <w:spacing w:lineRule="auto" w:line="240" w:before="0" w:after="0"/>
+        <w:rPr/>
+      </w:pPr>
+      <w:r>
+        <w:rPr>
+          <w:rFonts w:eastAsia="Courier New" w:cs="Courier New" w:ascii="Courier New" w:hAnsi="Courier New"/>
+          <w:sz w:val="16"/>
+          <w:szCs w:val="16"/>
+        </w:rPr>
+        <w:t xml:space="preserve">    </w:t>
+      </w:r>
+      <w:r>
+        <w:rPr>
+          <w:rFonts w:eastAsia="Courier New" w:cs="Courier New" w:ascii="Courier New" w:hAnsi="Courier New"/>
+          <w:sz w:val="16"/>
+          <w:szCs w:val="16"/>
+        </w:rPr>
+        <w:t>&lt;/article&gt;</w:t>
+      </w:r>
+    </w:p>
+    <w:p>
+      <w:pPr>
+        <w:pStyle w:val="Normal"/>
+        <w:spacing w:lineRule="auto" w:line="240" w:before="0" w:after="0"/>
+        <w:rPr/>
+      </w:pPr>
+      <w:r>
+        <w:rPr>
+          <w:rFonts w:eastAsia="Courier New" w:cs="Courier New" w:ascii="Courier New" w:hAnsi="Courier New"/>
+          <w:sz w:val="16"/>
+          <w:szCs w:val="16"/>
+        </w:rPr>
+        <w:t xml:space="preserve"> </w:t>
+      </w:r>
+    </w:p>
+    <w:p>
+      <w:pPr>
+        <w:pStyle w:val="Normal"/>
+        <w:spacing w:lineRule="auto" w:line="240" w:before="0" w:after="0"/>
+        <w:rPr/>
+      </w:pPr>
+      <w:r>
+        <w:rPr>
+          <w:rFonts w:eastAsia="Courier New" w:cs="Courier New" w:ascii="Courier New" w:hAnsi="Courier New"/>
+          <w:sz w:val="16"/>
+          <w:szCs w:val="16"/>
+        </w:rPr>
+        <w:t xml:space="preserve">    </w:t>
+      </w:r>
+      <w:r>
+        <w:rPr>
+          <w:rFonts w:eastAsia="Courier New" w:cs="Courier New" w:ascii="Courier New" w:hAnsi="Courier New"/>
+          <w:sz w:val="16"/>
+          <w:szCs w:val="16"/>
+        </w:rPr>
+        <w:t>&lt;article&gt;</w:t>
       </w:r>
     </w:p>
     <w:p>
@@ -5049,7 +5186,68 @@
           <w:sz w:val="16"/>
           <w:szCs w:val="16"/>
         </w:rPr>
-        <w:t>&lt;li&gt;&lt;a href="propiedad-detalle.html?id=7"&gt;Villa con piscina — Guanacaste&lt;/a&gt;&lt;/li&gt;</w:t>
+        <w:t>&lt;h3&gt;&lt;a href="propiedad-detalle.html?id=7"&gt;Villa con piscina — Guanacaste&lt;/a&gt;&lt;/h3&gt;</w:t>
+      </w:r>
+    </w:p>
+    <w:p>
+      <w:pPr>
+        <w:pStyle w:val="Normal"/>
+        <w:spacing w:lineRule="auto" w:line="240" w:before="0" w:after="0"/>
+        <w:rPr/>
+      </w:pPr>
+      <w:r>
+        <w:rPr>
+          <w:rFonts w:eastAsia="Courier New" w:cs="Courier New" w:ascii="Courier New" w:hAnsi="Courier New"/>
+          <w:sz w:val="16"/>
+          <w:szCs w:val="16"/>
+        </w:rPr>
+        <w:t xml:space="preserve">    </w:t>
+      </w:r>
+      <w:r>
+        <w:rPr>
+          <w:rFonts w:eastAsia="Courier New" w:cs="Courier New" w:ascii="Courier New" w:hAnsi="Courier New"/>
+          <w:sz w:val="16"/>
+          <w:szCs w:val="16"/>
+        </w:rPr>
+        <w:t>&lt;/article&gt;</w:t>
+      </w:r>
+    </w:p>
+    <w:p>
+      <w:pPr>
+        <w:pStyle w:val="Normal"/>
+        <w:spacing w:lineRule="auto" w:line="240" w:before="0" w:after="0"/>
+        <w:rPr/>
+      </w:pPr>
+      <w:r>
+        <w:rPr>
+          <w:rFonts w:eastAsia="Courier New" w:cs="Courier New" w:ascii="Courier New" w:hAnsi="Courier New"/>
+          <w:sz w:val="16"/>
+          <w:szCs w:val="16"/>
+        </w:rPr>
+        <w:t xml:space="preserve"> </w:t>
+      </w:r>
+    </w:p>
+    <w:p>
+      <w:pPr>
+        <w:pStyle w:val="Normal"/>
+        <w:spacing w:lineRule="auto" w:line="240" w:before="0" w:after="0"/>
+        <w:rPr/>
+      </w:pPr>
+      <w:r>
+        <w:rPr>
+          <w:rFonts w:eastAsia="Courier New" w:cs="Courier New" w:ascii="Courier New" w:hAnsi="Courier New"/>
+          <w:sz w:val="16"/>
+          <w:szCs w:val="16"/>
+        </w:rPr>
+        <w:t xml:space="preserve">    </w:t>
+      </w:r>
+      <w:r>
+        <w:rPr>
+          <w:rFonts w:eastAsia="Courier New" w:cs="Courier New" w:ascii="Courier New" w:hAnsi="Courier New"/>
+          <w:sz w:val="16"/>
+          <w:szCs w:val="16"/>
+        </w:rPr>
+        <w:t>&lt;article&gt;</w:t>
       </w:r>
     </w:p>
     <w:p>
@@ -5072,7 +5270,7 @@
           <w:sz w:val="16"/>
           <w:szCs w:val="16"/>
         </w:rPr>
-        <w:t>&lt;li&gt;&lt;a href="propiedad-detalle.html?id=8"&gt;Cabaña de montaña — Monteverde&lt;/a&gt;&lt;/li&gt;</w:t>
+        <w:t>&lt;h3&gt;&lt;a href="propiedad-detalle.html?id=8"&gt;Cabaña de montaña — Monteverde&lt;/a&gt;&lt;/h3&gt;</w:t>
       </w:r>
     </w:p>
     <w:p>
@@ -5095,7 +5293,7 @@
           <w:sz w:val="16"/>
           <w:szCs w:val="16"/>
         </w:rPr>
-        <w:t>&lt;/ul&gt;</w:t>
+        <w:t>&lt;/article&gt;</w:t>
       </w:r>
     </w:p>
     <w:p>
@@ -5118,7 +5316,7 @@
           <w:sz w:val="16"/>
           <w:szCs w:val="16"/>
         </w:rPr>
-        <w:t>&lt;/aside&gt;</w:t>
+        <w:t>&lt;/section&gt;</w:t>
       </w:r>
     </w:p>
     <w:p>

</xml_diff>

<commit_message>
Cambiar 'Recomendado para ti' a section/article con texto descriptivo y actualizar docx de Parte 1
</commit_message>
<xml_diff>
--- a/taller-1/parte-1/Taller1-Parte1-StayBooker360.docx
+++ b/taller-1/parte-1/Taller1-Parte1-StayBooker360.docx
@@ -250,26 +250,6 @@
           <w:szCs w:val="32"/>
         </w:rPr>
         <w:t>Parte 1</w:t>
-      </w:r>
-    </w:p>
-    <w:p>
-      <w:pPr>
-        <w:pStyle w:val="Normal"/>
-        <w:keepNext w:val="false"/>
-        <w:keepLines w:val="false"/>
-        <w:spacing w:lineRule="auto" w:line="360"/>
-        <w:rPr>
-          <w:rFonts w:ascii="Times New Roman" w:hAnsi="Times New Roman" w:eastAsia="Times New Roman" w:cs="Times New Roman"/>
-          <w:sz w:val="24"/>
-          <w:szCs w:val="24"/>
-        </w:rPr>
-      </w:pPr>
-      <w:r>
-        <w:rPr>
-          <w:rFonts w:eastAsia="Times New Roman" w:cs="Times New Roman"/>
-          <w:sz w:val="24"/>
-          <w:szCs w:val="24"/>
-        </w:rPr>
       </w:r>
     </w:p>
     <w:p>
@@ -550,7 +530,14 @@
           <w:rFonts w:eastAsia="Arial" w:cs="Arial"/>
           <w:szCs w:val="24"/>
         </w:rPr>
-        <w:t>La propuesta contempla un entorno donde conviven tres perfiles de usuario —huésped, anfitrión y administrador— y organiza la información del sitio de manera jerárquica y semánticamente correcta, separando siempre la estructura (HTML) de la presentación (CSS y JS, que no se implementa en esta entrega).</w:t>
+        <w:t xml:space="preserve">La propuesta contempla un entorno donde conviven tres perfiles de usuario: huésped, anfitrión y administrador, </w:t>
+      </w:r>
+      <w:r>
+        <w:rPr>
+          <w:rFonts w:eastAsia="Arial" w:cs="Arial"/>
+          <w:szCs w:val="24"/>
+        </w:rPr>
+        <w:t>cada uno con sus opciones exclusivas y algunas compartidas.</w:t>
       </w:r>
     </w:p>
     <w:p>
@@ -587,7 +574,14 @@
           <w:rFonts w:eastAsia="Arial" w:cs="Arial"/>
           <w:szCs w:val="24"/>
         </w:rPr>
-        <w:t>El alcance de esta propuesta es la página principal (index.html), que se organiza en siete bloques estructurales, mostrados en el orden en que aparecen en el documento:</w:t>
+        <w:t>La</w:t>
+      </w:r>
+      <w:r>
+        <w:rPr>
+          <w:rFonts w:eastAsia="Arial" w:cs="Arial"/>
+          <w:szCs w:val="24"/>
+        </w:rPr>
+        <w:t xml:space="preserve"> página principal (index.html) se organiza en siete bloques estructurales, mostrados en el orden en que aparecen en el documento:</w:t>
       </w:r>
     </w:p>
     <w:p>
@@ -1018,7 +1012,7 @@
           <w:sz w:val="24"/>
           <w:szCs w:val="24"/>
         </w:rPr>
-        <w:t>&lt;section&gt;: divide bloques temáticos, cada uno con su propio encabezado (h2).</w:t>
+        <w:t>&lt;section&gt;: divide bloques temáticos, cada uno con su propio encabezado.</w:t>
       </w:r>
     </w:p>
     <w:p>
@@ -1041,7 +1035,7 @@
           <w:sz w:val="24"/>
           <w:szCs w:val="24"/>
         </w:rPr>
-        <w:t xml:space="preserve">&lt;article&gt;: </w:t>
+        <w:t xml:space="preserve">&lt;article&gt;: separa el contenido de una sección que usualmente es repetible (propiedad, tipo de alojamiento, promoción, </w:t>
       </w:r>
       <w:r>
         <w:rPr>
@@ -1049,7 +1043,7 @@
           <w:sz w:val="24"/>
           <w:szCs w:val="24"/>
         </w:rPr>
-        <w:t>separa el contenido de una sección que usualmente es</w:t>
+        <w:t>recomendación</w:t>
       </w:r>
       <w:r>
         <w:rPr>
@@ -1057,7 +1051,7 @@
           <w:sz w:val="24"/>
           <w:szCs w:val="24"/>
         </w:rPr>
-        <w:t xml:space="preserve"> repetible (propiedad, tipo de alojamiento, promoción).</w:t>
+        <w:t>).</w:t>
       </w:r>
     </w:p>
     <w:p>
@@ -1251,23 +1245,7 @@
           <w:sz w:val="24"/>
           <w:szCs w:val="24"/>
         </w:rPr>
-        <w:t xml:space="preserve">Idioma y moneda: ES, EN, FR, Colones (CRC), Dólares (USD) — estructura multilingüe </w:t>
-      </w:r>
-      <w:r>
-        <w:rPr>
-          <w:rFonts w:eastAsia="Arial" w:cs="Arial" w:ascii="Arial" w:hAnsi="Arial"/>
-          <w:sz w:val="24"/>
-          <w:szCs w:val="24"/>
-        </w:rPr>
-        <w:t>y multi moneda</w:t>
-      </w:r>
-      <w:r>
-        <w:rPr>
-          <w:rFonts w:eastAsia="Arial" w:cs="Arial" w:ascii="Arial" w:hAnsi="Arial"/>
-          <w:sz w:val="24"/>
-          <w:szCs w:val="24"/>
-        </w:rPr>
-        <w:t>.</w:t>
+        <w:t>Idioma y moneda: ES, EN, FR, Colones (CRC), Dólares (USD) — estructura multilingüe y multi moneda.</w:t>
       </w:r>
     </w:p>
     <w:p>
@@ -1323,7 +1301,27 @@
           <w:sz w:val="28"/>
           <w:szCs w:val="28"/>
         </w:rPr>
-        <w:t>6.1 Visualización en el navegador</w:t>
+        <w:t xml:space="preserve">6.1 Visualización </w:t>
+      </w:r>
+      <w:r>
+        <w:rPr>
+          <w:rFonts w:eastAsia="Arial" w:cs="Arial" w:ascii="Arial" w:hAnsi="Arial"/>
+          <w:b/>
+          <w:bCs/>
+          <w:sz w:val="28"/>
+          <w:szCs w:val="28"/>
+        </w:rPr>
+        <w:t>parcial</w:t>
+      </w:r>
+      <w:r>
+        <w:rPr>
+          <w:rFonts w:eastAsia="Arial" w:cs="Arial" w:ascii="Arial" w:hAnsi="Arial"/>
+          <w:b/>
+          <w:bCs/>
+          <w:sz w:val="28"/>
+          <w:szCs w:val="28"/>
+        </w:rPr>
+        <w:t xml:space="preserve"> en el navegador</w:t>
       </w:r>
     </w:p>
     <w:p>
@@ -1390,7 +1388,7 @@
             <wp:positionV relativeFrom="paragraph">
               <wp:posOffset>635</wp:posOffset>
             </wp:positionV>
-            <wp:extent cx="5792470" cy="4606925"/>
+            <wp:extent cx="5792470" cy="5531485"/>
             <wp:effectExtent l="0" t="0" r="0" b="0"/>
             <wp:wrapSquare wrapText="largest"/>
             <wp:docPr id="2" name="Image2"/>
@@ -1415,7 +1413,7 @@
                   <pic:spPr bwMode="auto">
                     <a:xfrm>
                       <a:off x="0" y="0"/>
-                      <a:ext cx="5792470" cy="4606925"/>
+                      <a:ext cx="5792470" cy="5531485"/>
                     </a:xfrm>
                     <a:prstGeom prst="rect">
                       <a:avLst/>
@@ -1428,40 +1426,6 @@
           </wp:anchor>
         </w:drawing>
       </w:r>
-    </w:p>
-    <w:p>
-      <w:pPr>
-        <w:pStyle w:val="Normal"/>
-        <w:spacing w:before="0" w:after="200"/>
-        <w:jc w:val="both"/>
-        <w:rPr/>
-      </w:pPr>
-      <w:r>
-        <w:rPr/>
-      </w:r>
-    </w:p>
-    <w:p>
-      <w:pPr>
-        <w:pStyle w:val="Normal"/>
-        <w:spacing w:before="200" w:after="80"/>
-        <w:jc w:val="center"/>
-        <w:rPr>
-          <w:rFonts w:ascii="Arial" w:hAnsi="Arial" w:eastAsia="Arial" w:cs="Arial"/>
-          <w:i/>
-          <w:iCs/>
-          <w:sz w:val="20"/>
-          <w:szCs w:val="20"/>
-        </w:rPr>
-      </w:pPr>
-      <w:r>
-        <w:rPr>
-          <w:rFonts w:eastAsia="Arial" w:cs="Arial" w:ascii="Arial" w:hAnsi="Arial"/>
-          <w:i/>
-          <w:iCs/>
-          <w:sz w:val="20"/>
-          <w:szCs w:val="20"/>
-        </w:rPr>
-      </w:r>
       <w:r>
         <w:br w:type="page"/>
       </w:r>
@@ -1480,7 +1444,27 @@
           <w:sz w:val="28"/>
           <w:szCs w:val="28"/>
         </w:rPr>
-        <w:t>6.2 Código fuente (etiquetas y estructura HTML5)</w:t>
+        <w:t xml:space="preserve">6.2 </w:t>
+      </w:r>
+      <w:r>
+        <w:rPr>
+          <w:rFonts w:eastAsia="Arial" w:cs="Arial" w:ascii="Arial" w:hAnsi="Arial"/>
+          <w:b/>
+          <w:bCs/>
+          <w:sz w:val="28"/>
+          <w:szCs w:val="28"/>
+        </w:rPr>
+        <w:t>Extracto de c</w:t>
+      </w:r>
+      <w:r>
+        <w:rPr>
+          <w:rFonts w:eastAsia="Arial" w:cs="Arial" w:ascii="Arial" w:hAnsi="Arial"/>
+          <w:b/>
+          <w:bCs/>
+          <w:sz w:val="28"/>
+          <w:szCs w:val="28"/>
+        </w:rPr>
+        <w:t>ódigo fuente</w:t>
       </w:r>
     </w:p>
     <w:p>
@@ -1496,7 +1480,15 @@
           <w:sz w:val="24"/>
           <w:szCs w:val="24"/>
         </w:rPr>
-        <w:t>A continuación se presenta el código fuente completo de la página principal (index.html), entregado también como archivo independiente junto con este documento.</w:t>
+        <w:t xml:space="preserve">A continuación se presenta el código de la página principal (index.html), </w:t>
+      </w:r>
+      <w:r>
+        <w:rPr>
+          <w:rFonts w:eastAsia="Arial" w:cs="Arial" w:ascii="Arial" w:hAnsi="Arial"/>
+          <w:sz w:val="24"/>
+          <w:szCs w:val="24"/>
+        </w:rPr>
+        <w:t>para dar una idea de la estructura utilizada:</w:t>
       </w:r>
     </w:p>
     <w:p>
@@ -6921,8 +6913,8 @@
       <w:u w:val="single"/>
     </w:rPr>
   </w:style>
-  <w:style w:type="character" w:styleId="FootnoteCharacters">
-    <w:name w:val="Footnote Characters"/>
+  <w:style w:type="character" w:styleId="FootnoteCharactersuser">
+    <w:name w:val="Footnote Characters (user)"/>
     <w:uiPriority w:val="99"/>
     <w:semiHidden/>
     <w:unhideWhenUsed/>
@@ -6931,8 +6923,8 @@
       <w:vertAlign w:val="superscript"/>
     </w:rPr>
   </w:style>
-  <w:style w:type="character" w:styleId="FootnoteCharactersuser">
-    <w:name w:val="Footnote Characters (user)"/>
+  <w:style w:type="character" w:styleId="FootnoteCharacters">
+    <w:name w:val="Footnote Characters"/>
     <w:qFormat/>
     <w:rPr>
       <w:vertAlign w:val="superscript"/>
@@ -6956,8 +6948,8 @@
       <w:szCs w:val="20"/>
     </w:rPr>
   </w:style>
-  <w:style w:type="character" w:styleId="EndnoteCharacters">
-    <w:name w:val="Endnote Characters"/>
+  <w:style w:type="character" w:styleId="EndnoteCharactersuser">
+    <w:name w:val="Endnote Characters (user)"/>
     <w:uiPriority w:val="99"/>
     <w:semiHidden/>
     <w:unhideWhenUsed/>
@@ -6966,8 +6958,8 @@
       <w:vertAlign w:val="superscript"/>
     </w:rPr>
   </w:style>
-  <w:style w:type="character" w:styleId="EndnoteCharactersuser">
-    <w:name w:val="Endnote Characters (user)"/>
+  <w:style w:type="character" w:styleId="EndnoteCharacters">
+    <w:name w:val="Endnote Characters"/>
     <w:qFormat/>
     <w:rPr>
       <w:vertAlign w:val="superscript"/>
@@ -6991,8 +6983,8 @@
       <w:szCs w:val="20"/>
     </w:rPr>
   </w:style>
-  <w:style w:type="character" w:styleId="Bullets">
-    <w:name w:val="Bullets"/>
+  <w:style w:type="character" w:styleId="Bulletsuser">
+    <w:name w:val="Bullets (user)"/>
     <w:qFormat/>
     <w:rPr>
       <w:rFonts w:ascii="OpenSymbol" w:hAnsi="OpenSymbol" w:eastAsia="OpenSymbol" w:cs="OpenSymbol"/>

</xml_diff>